<commit_message>
Complete all 3 Word documents from OCR'd property lease PDFs
All documents cleaned and assembled:
- License for Consulting 1973 (4 pages) - permits basement consulting room
- Sublease to Newnhams 1973 (26 pages) - ground/basement maisonette sublease
- License for Conversion 1972 (11 pages) - conversion to flats/maisonettes

OCR cleanup: proper names corrected (Phillimore, Newnham, Cornwall, Fernando),
scan noise removed, common typewriter OCR errors fixed, legal structure preserved.
Page 26 of sublease marked as architectural floor plan.

https://claude.ai/code/session_01BKUuQUqscRFSnXdaV7eTvz
</commit_message>
<xml_diff>
--- a/output/20 Hornton Street License for Conversion -- 1972.docx
+++ b/output/20 Hornton Street License for Conversion -- 1972.docx
@@ -61,7 +61,7 @@
     <w:p>
       <w:pPr/>
       <w:r>
-        <w:t>1. The Licensors hereby grant unto the Licensee(s) licence to convert the premises into and use or allow the user of the same as and for one high class private residential self-contained flat/maisonette on the ground and basement floors one high class private residential self-contained flat/maisonette on the first and second floors one high class private residential self-contained flat/maisonette on the third and fourth floors which said conversion works (hereinafter called "the conversion works") shall be in accordance with the drawing(s) annexed hereto and numbered Gd 266725 which have been approved by the Licensors' Surveyors (hereinafter called "the Estate Surveyors")</w:t>
+        <w:t>1. The Licensors hereby grant unto the Licensee(s) licence to convert the premises into and use or allow the user of the same as and for one high class private residential self-contained flat/maisonette on the ground and basement floors one high class private residential self-contained flat/maisonette on the first and second floors one high class private residential self-contained flat/maisonette on the third and fourth floors which said conversion works (hereinafter called "the conversion works") shall be in accordance with the drawing(s) annexed hereto and Numbered Gd 2667/5 which have been approved by the Licensors' Surveyors (hereinafter called "the Estate Surveyors")</w:t>
       </w:r>
     </w:p>
     <w:p>
@@ -79,12 +79,6 @@
     <w:p>
       <w:r>
         <w:br w:type="page"/>
-      </w:r>
-    </w:p>
-    <w:p>
-      <w:pPr/>
-      <w:r>
-        <w:t>(hereinafter called "the additional rent") payable by the like instalments and on the same dates as the existing rent</w:t>
       </w:r>
     </w:p>
     <w:p>
@@ -120,7 +114,7 @@
     <w:p>
       <w:pPr/>
       <w:r>
-        <w:t>(6) (i) That the Lease shall in addition to and not in substitution for the existing rent also reserve and make payable from and after the due execution and completion of the conversion works or on the expiration of twelve months from the date hereof whichever shall be the sooner during the residue of the term granted by the Lease the additional yearly rent of £ and the additional yearly garden rate of £ (hereinafter</w:t>
+        <w:t>(6) (i) That the Lease shall in addition to and not in substitution for the existing rent also reserve and make payable from and after the due execution and completion of the conversion works or on the expiration of twelve months from the date hereof whichever shall be the sooner during the residue of the term granted by the Lease the additional yearly rent of £ (hereinafter called "the additional rent") payable by the like instalments and on the same dates as the existing rent</w:t>
       </w:r>
     </w:p>
     <w:p>
@@ -137,7 +131,7 @@
     <w:p>
       <w:pPr/>
       <w:r>
-        <w:t>(iii) The Licensee(s) hereby covenants to pay the existing rent and the additional rent as aforesaid</w:t>
+        <w:t>(iii) The Licensee(s) hereby covenant(s) to pay the existing rent and the additional rent as aforesaid</w:t>
       </w:r>
     </w:p>
     <w:p>
@@ -346,7 +340,7 @@
     <w:p>
       <w:pPr/>
       <w:r>
-        <w:t>THE PHILLIMORE KENSINGTON ESTATE</w:t>
+        <w:t>THE PHILLIMORE KENSINGTON ESTATE.</w:t>
       </w:r>
     </w:p>
     <w:p>

</xml_diff>